<commit_message>
fix: papier à en-tête — filets jaunes bordure para, Montserrat/Helvetica, titre #3B77B4
Co-Authored-By: Claude Sonnet 4.6 <noreply@anthropic.com>
</commit_message>
<xml_diff>
--- a/docs/modeles/papier-entete-HSI37.docx
+++ b/docs/modeles/papier-entete-HSI37.docx
@@ -8,6 +8,7 @@
       </w:pPr>
       <w:r>
         <w:rPr>
+          <w:rFonts w:ascii="Helvetica" w:hAnsi="Helvetica"/>
           <w:color w:val="403E3E"/>
           <w:sz w:val="22"/>
         </w:rPr>
@@ -27,46 +28,14 @@
 
 <file path=word/footer1.xml><?xml version="1.0" encoding="utf-8"?>
 <w:ftr xmlns:m="http://schemas.openxmlformats.org/officeDocument/2006/math" xmlns:mc="http://schemas.openxmlformats.org/markup-compatibility/2006" xmlns:mo="http://schemas.microsoft.com/office/mac/office/2008/main" xmlns:mv="urn:schemas-microsoft-com:mac:vml" xmlns:o="urn:schemas-microsoft-com:office:office" xmlns:r="http://schemas.openxmlformats.org/officeDocument/2006/relationships" xmlns:v="urn:schemas-microsoft-com:vml" xmlns:w10="urn:schemas-microsoft-com:office:word" xmlns:w14="http://schemas.microsoft.com/office/word/2010/wordml" xmlns:w="http://schemas.openxmlformats.org/wordprocessingml/2006/main" xmlns:wne="http://schemas.microsoft.com/office/word/2006/wordml" xmlns:wp14="http://schemas.microsoft.com/office/word/2010/wordprocessingDrawing" xmlns:wp="http://schemas.openxmlformats.org/drawingml/2006/wordprocessingDrawing" xmlns:wpc="http://schemas.microsoft.com/office/word/2010/wordprocessingCanvas" xmlns:wpg="http://schemas.microsoft.com/office/word/2010/wordprocessingGroup" xmlns:wpi="http://schemas.microsoft.com/office/word/2010/wordprocessingInk" xmlns:wps="http://schemas.microsoft.com/office/word/2010/wordprocessingShape" mc:Ignorable="w14 wp14">
-  <w:tbl>
-    <w:tblPr>
-      <w:tblW w:type="auto" w:w="0"/>
-      <w:tblLook w:firstColumn="1" w:firstRow="1" w:lastColumn="0" w:lastRow="0" w:noHBand="0" w:noVBand="1" w:val="04A0"/>
-      <w:tblBorders>
-        <w:top w:val="nil"/>
-        <w:left w:val="nil"/>
-        <w:bottom w:val="nil"/>
-        <w:right w:val="nil"/>
-        <w:insideH w:val="nil"/>
-        <w:insideV w:val="nil"/>
-      </w:tblBorders>
-    </w:tblPr>
-    <w:tblGrid>
-      <w:gridCol w:w="9071"/>
-    </w:tblGrid>
-    <w:tr>
-      <w:trPr>
-        <w:trHeight w:val="60" w:hRule="exact"/>
-      </w:trPr>
-      <w:tc>
-        <w:tcPr>
-          <w:tcW w:type="dxa" w:w="9071"/>
-          <w:shd w:val="clear" w:color="auto" w:fill="F7CD46"/>
-          <w:tcW w:w="9070" w:type="dxa"/>
-          <w:tcBorders>
-            <w:top w:val="nil"/>
-            <w:left w:val="nil"/>
-            <w:bottom w:val="nil"/>
-            <w:right w:val="nil"/>
-          </w:tcBorders>
-        </w:tcPr>
-        <w:p>
-          <w:pPr>
-            <w:spacing w:before="0" w:after="0"/>
-          </w:pPr>
-        </w:p>
-      </w:tc>
-    </w:tr>
-  </w:tbl>
+  <w:p>
+    <w:pPr>
+      <w:spacing w:before="0" w:after="40"/>
+      <w:pBdr>
+        <w:top w:val="single" w:sz="16" w:space="0" w:color="F7CD46"/>
+      </w:pBdr>
+    </w:pPr>
+  </w:p>
   <w:p>
     <w:pPr>
       <w:jc w:val="center"/>
@@ -74,6 +43,7 @@
     </w:pPr>
     <w:r>
       <w:rPr>
+        <w:rFonts w:ascii="Helvetica" w:hAnsi="Helvetica"/>
         <w:b w:val="0"/>
         <w:color w:val="403E3E"/>
         <w:sz w:val="16"/>
@@ -190,6 +160,7 @@
           </w:pPr>
           <w:r>
             <w:rPr>
+              <w:rFonts w:ascii="Helvetica" w:hAnsi="Helvetica"/>
               <w:b/>
               <w:color w:val="3B77B4"/>
               <w:sz w:val="22"/>
@@ -204,6 +175,7 @@
           </w:pPr>
           <w:r>
             <w:rPr>
+              <w:rFonts w:ascii="Helvetica" w:hAnsi="Helvetica"/>
               <w:b w:val="0"/>
               <w:color w:val="403E3E"/>
               <w:sz w:val="18"/>
@@ -218,6 +190,7 @@
           </w:pPr>
           <w:r>
             <w:rPr>
+              <w:rFonts w:ascii="Helvetica" w:hAnsi="Helvetica"/>
               <w:b w:val="0"/>
               <w:color w:val="403E3E"/>
               <w:sz w:val="18"/>
@@ -232,6 +205,7 @@
           </w:pPr>
           <w:r>
             <w:rPr>
+              <w:rFonts w:ascii="Helvetica" w:hAnsi="Helvetica"/>
               <w:b w:val="0"/>
               <w:color w:val="403E3E"/>
               <w:sz w:val="16"/>
@@ -244,52 +218,10 @@
   </w:tbl>
   <w:p>
     <w:pPr>
-      <w:spacing w:before="60" w:after="0"/>
-    </w:pPr>
-  </w:p>
-  <w:tbl>
-    <w:tblPr>
-      <w:tblW w:type="auto" w:w="0"/>
-      <w:tblLook w:firstColumn="1" w:firstRow="1" w:lastColumn="0" w:lastRow="0" w:noHBand="0" w:noVBand="1" w:val="04A0"/>
-      <w:tblBorders>
-        <w:top w:val="nil"/>
-        <w:left w:val="nil"/>
-        <w:bottom w:val="nil"/>
-        <w:right w:val="nil"/>
-        <w:insideH w:val="nil"/>
-        <w:insideV w:val="nil"/>
-      </w:tblBorders>
-    </w:tblPr>
-    <w:tblGrid>
-      <w:gridCol w:w="9071"/>
-    </w:tblGrid>
-    <w:tr>
-      <w:trPr>
-        <w:trHeight w:val="80" w:hRule="exact"/>
-      </w:trPr>
-      <w:tc>
-        <w:tcPr>
-          <w:tcW w:type="dxa" w:w="9071"/>
-          <w:shd w:val="clear" w:color="auto" w:fill="F7CD46"/>
-          <w:tcW w:w="9070" w:type="dxa"/>
-          <w:tcBorders>
-            <w:top w:val="nil"/>
-            <w:left w:val="nil"/>
-            <w:bottom w:val="nil"/>
-            <w:right w:val="nil"/>
-          </w:tcBorders>
-        </w:tcPr>
-        <w:p>
-          <w:pPr>
-            <w:spacing w:before="0" w:after="0"/>
-          </w:pPr>
-        </w:p>
-      </w:tc>
-    </w:tr>
-  </w:tbl>
-  <w:p>
-    <w:pPr>
-      <w:spacing w:before="0" w:after="0"/>
+      <w:spacing w:before="80" w:after="0"/>
+      <w:pBdr>
+        <w:bottom w:val="single" w:sz="16" w:space="0" w:color="F7CD46"/>
+      </w:pBdr>
     </w:pPr>
   </w:p>
 </w:hdr>

</xml_diff>

<commit_message>
docs: mettre à jour papier-entete-HSI37.docx
Co-Authored-By: Claude Sonnet 4.6 <noreply@anthropic.com>
</commit_message>
<xml_diff>
--- a/docs/modeles/papier-entete-HSI37.docx
+++ b/docs/modeles/papier-entete-HSI37.docx
@@ -8,7 +8,7 @@
       </w:pPr>
       <w:r>
         <w:rPr>
-          <w:rFonts w:ascii="Helvetica" w:hAnsi="Helvetica"/>
+          <w:rFonts w:ascii="Montserrat" w:hAnsi="Montserrat"/>
           <w:color w:val="403E3E"/>
           <w:sz w:val="22"/>
         </w:rPr>
@@ -43,7 +43,7 @@
     </w:pPr>
     <w:r>
       <w:rPr>
-        <w:rFonts w:ascii="Helvetica" w:hAnsi="Helvetica"/>
+        <w:rFonts w:ascii="Montserrat" w:hAnsi="Montserrat"/>
         <w:b w:val="0"/>
         <w:color w:val="403E3E"/>
         <w:sz w:val="16"/>
@@ -160,7 +160,7 @@
           </w:pPr>
           <w:r>
             <w:rPr>
-              <w:rFonts w:ascii="Helvetica" w:hAnsi="Helvetica"/>
+              <w:rFonts w:ascii="Montserrat" w:hAnsi="Montserrat"/>
               <w:b/>
               <w:color w:val="3B77B4"/>
               <w:sz w:val="22"/>
@@ -175,7 +175,7 @@
           </w:pPr>
           <w:r>
             <w:rPr>
-              <w:rFonts w:ascii="Helvetica" w:hAnsi="Helvetica"/>
+              <w:rFonts w:ascii="Montserrat" w:hAnsi="Montserrat"/>
               <w:b w:val="0"/>
               <w:color w:val="403E3E"/>
               <w:sz w:val="18"/>
@@ -190,7 +190,7 @@
           </w:pPr>
           <w:r>
             <w:rPr>
-              <w:rFonts w:ascii="Helvetica" w:hAnsi="Helvetica"/>
+              <w:rFonts w:ascii="Montserrat" w:hAnsi="Montserrat"/>
               <w:b w:val="0"/>
               <w:color w:val="403E3E"/>
               <w:sz w:val="18"/>
@@ -205,7 +205,7 @@
           </w:pPr>
           <w:r>
             <w:rPr>
-              <w:rFonts w:ascii="Helvetica" w:hAnsi="Helvetica"/>
+              <w:rFonts w:ascii="Montserrat" w:hAnsi="Montserrat"/>
               <w:b w:val="0"/>
               <w:color w:val="403E3E"/>
               <w:sz w:val="16"/>

</xml_diff>